<commit_message>
Update AI document with new content and revisions.
</commit_message>
<xml_diff>
--- a/ai对话截图.docx
+++ b/ai对话截图.docx
@@ -9,7 +9,6 @@
           <w:lang w:eastAsia="zh-CN"/>
         </w:rPr>
       </w:pPr>
-      <w:bookmarkStart w:id="0" w:name="_GoBack"/>
       <w:r>
         <w:rPr>
           <w:rFonts w:hint="eastAsia" w:eastAsiaTheme="minorEastAsia"/>
@@ -53,7 +52,22 @@
           </wp:inline>
         </w:drawing>
       </w:r>
-      <w:bookmarkEnd w:id="0"/>
+    </w:p>
+    <w:p>
+      <w:pPr>
+        <w:rPr>
+          <w:rFonts w:hint="eastAsia" w:eastAsiaTheme="minorEastAsia"/>
+          <w:lang w:eastAsia="zh-CN"/>
+        </w:rPr>
+      </w:pPr>
+    </w:p>
+    <w:p>
+      <w:pPr>
+        <w:rPr>
+          <w:rFonts w:hint="eastAsia" w:eastAsiaTheme="minorEastAsia"/>
+          <w:lang w:eastAsia="zh-CN"/>
+        </w:rPr>
+      </w:pPr>
       <w:r>
         <w:rPr>
           <w:rFonts w:hint="eastAsia" w:eastAsiaTheme="minorEastAsia"/>
@@ -140,6 +154,22 @@
           </wp:inline>
         </w:drawing>
       </w:r>
+    </w:p>
+    <w:p>
+      <w:pPr>
+        <w:rPr>
+          <w:rFonts w:hint="eastAsia" w:eastAsiaTheme="minorEastAsia"/>
+          <w:lang w:eastAsia="zh-CN"/>
+        </w:rPr>
+      </w:pPr>
+    </w:p>
+    <w:p>
+      <w:pPr>
+        <w:rPr>
+          <w:rFonts w:hint="eastAsia" w:eastAsiaTheme="minorEastAsia"/>
+          <w:lang w:eastAsia="zh-CN"/>
+        </w:rPr>
+      </w:pPr>
       <w:r>
         <w:rPr>
           <w:rFonts w:hint="eastAsia" w:eastAsiaTheme="minorEastAsia"/>
@@ -183,6 +213,22 @@
           </wp:inline>
         </w:drawing>
       </w:r>
+    </w:p>
+    <w:p>
+      <w:pPr>
+        <w:rPr>
+          <w:rFonts w:hint="eastAsia" w:eastAsiaTheme="minorEastAsia"/>
+          <w:lang w:eastAsia="zh-CN"/>
+        </w:rPr>
+      </w:pPr>
+    </w:p>
+    <w:p>
+      <w:pPr>
+        <w:rPr>
+          <w:rFonts w:hint="eastAsia" w:eastAsiaTheme="minorEastAsia"/>
+          <w:lang w:eastAsia="zh-CN"/>
+        </w:rPr>
+      </w:pPr>
       <w:r>
         <w:rPr>
           <w:rFonts w:hint="eastAsia" w:eastAsiaTheme="minorEastAsia"/>
@@ -269,6 +315,22 @@
           </wp:inline>
         </w:drawing>
       </w:r>
+    </w:p>
+    <w:p>
+      <w:pPr>
+        <w:rPr>
+          <w:rFonts w:hint="eastAsia" w:eastAsiaTheme="minorEastAsia"/>
+          <w:lang w:eastAsia="zh-CN"/>
+        </w:rPr>
+      </w:pPr>
+    </w:p>
+    <w:p>
+      <w:pPr>
+        <w:rPr>
+          <w:rFonts w:hint="eastAsia" w:eastAsiaTheme="minorEastAsia"/>
+          <w:lang w:eastAsia="zh-CN"/>
+        </w:rPr>
+      </w:pPr>
       <w:r>
         <w:rPr>
           <w:rFonts w:hint="eastAsia" w:eastAsiaTheme="minorEastAsia"/>
@@ -312,6 +374,22 @@
           </wp:inline>
         </w:drawing>
       </w:r>
+    </w:p>
+    <w:p>
+      <w:pPr>
+        <w:rPr>
+          <w:rFonts w:hint="eastAsia" w:eastAsiaTheme="minorEastAsia"/>
+          <w:lang w:eastAsia="zh-CN"/>
+        </w:rPr>
+      </w:pPr>
+    </w:p>
+    <w:p>
+      <w:pPr>
+        <w:rPr>
+          <w:rFonts w:hint="eastAsia" w:eastAsiaTheme="minorEastAsia"/>
+          <w:lang w:eastAsia="zh-CN"/>
+        </w:rPr>
+      </w:pPr>
       <w:r>
         <w:rPr>
           <w:rFonts w:hint="eastAsia" w:eastAsiaTheme="minorEastAsia"/>
@@ -398,6 +476,22 @@
           </wp:inline>
         </w:drawing>
       </w:r>
+    </w:p>
+    <w:p>
+      <w:pPr>
+        <w:rPr>
+          <w:rFonts w:hint="eastAsia" w:eastAsiaTheme="minorEastAsia"/>
+          <w:lang w:eastAsia="zh-CN"/>
+        </w:rPr>
+      </w:pPr>
+    </w:p>
+    <w:p>
+      <w:pPr>
+        <w:rPr>
+          <w:rFonts w:hint="eastAsia" w:eastAsiaTheme="minorEastAsia"/>
+          <w:lang w:eastAsia="zh-CN"/>
+        </w:rPr>
+      </w:pPr>
       <w:r>
         <w:rPr>
           <w:rFonts w:hint="eastAsia" w:eastAsiaTheme="minorEastAsia"/>
@@ -441,6 +535,24 @@
           </wp:inline>
         </w:drawing>
       </w:r>
+    </w:p>
+    <w:p>
+      <w:pPr>
+        <w:rPr>
+          <w:rFonts w:hint="eastAsia" w:eastAsiaTheme="minorEastAsia"/>
+          <w:lang w:eastAsia="zh-CN"/>
+        </w:rPr>
+      </w:pPr>
+      <w:bookmarkStart w:id="0" w:name="_GoBack"/>
+      <w:bookmarkEnd w:id="0"/>
+    </w:p>
+    <w:p>
+      <w:pPr>
+        <w:rPr>
+          <w:rFonts w:hint="eastAsia" w:eastAsiaTheme="minorEastAsia"/>
+          <w:lang w:eastAsia="zh-CN"/>
+        </w:rPr>
+      </w:pPr>
       <w:r>
         <w:rPr>
           <w:rFonts w:hint="eastAsia" w:eastAsiaTheme="minorEastAsia"/>
@@ -484,6 +596,22 @@
           </wp:inline>
         </w:drawing>
       </w:r>
+    </w:p>
+    <w:p>
+      <w:pPr>
+        <w:rPr>
+          <w:rFonts w:hint="eastAsia" w:eastAsiaTheme="minorEastAsia"/>
+          <w:lang w:eastAsia="zh-CN"/>
+        </w:rPr>
+      </w:pPr>
+    </w:p>
+    <w:p>
+      <w:pPr>
+        <w:rPr>
+          <w:rFonts w:hint="eastAsia" w:eastAsiaTheme="minorEastAsia"/>
+          <w:lang w:eastAsia="zh-CN"/>
+        </w:rPr>
+      </w:pPr>
       <w:r>
         <w:rPr>
           <w:rFonts w:hint="eastAsia" w:eastAsiaTheme="minorEastAsia"/>

</xml_diff>